<commit_message>
docs: update student name (Siddharth Sonkar) and roll number (23051628) across all project files
</commit_message>
<xml_diff>
--- a/Capstone_Project_Report_UPI_Fraud_Signals.docx
+++ b/Capstone_Project_Report_UPI_Fraud_Signals.docx
@@ -41,6 +41,49 @@
         <w:gridCol w:w="4680"/>
         <w:gridCol w:w="4680"/>
       </w:tblGrid>
+      <w:tr>
+        <w:tc>
+          <w:tcPr>
+            <w:tcW w:type="dxa" w:w="4680"/>
+            <w:shd w:fill="F1F5F9"/>
+            <w:tcMar>
+              <w:top w:w="60" w:type="dxa"/>
+              <w:bottom w:w="60" w:type="dxa"/>
+              <w:left w:w="100" w:type="dxa"/>
+              <w:right w:w="100" w:type="dxa"/>
+            </w:tcMar>
+          </w:tcPr>
+          <w:p>
+            <w:r>
+              <w:rPr>
+                <w:b/>
+                <w:sz w:val="19"/>
+              </w:rPr>
+              <w:t>Student Name &amp; Roll No:</w:t>
+            </w:r>
+          </w:p>
+        </w:tc>
+        <w:tc>
+          <w:tcPr>
+            <w:tcW w:type="dxa" w:w="4680"/>
+            <w:shd w:fill="F8FAFC"/>
+            <w:tcMar>
+              <w:top w:w="60" w:type="dxa"/>
+              <w:bottom w:w="60" w:type="dxa"/>
+              <w:left w:w="100" w:type="dxa"/>
+              <w:right w:w="100" w:type="dxa"/>
+            </w:tcMar>
+          </w:tcPr>
+          <w:p>
+            <w:r>
+              <w:rPr>
+                <w:sz w:val="19"/>
+              </w:rPr>
+              <w:t>Siddharth Sonkar | Roll No: 23051628</w:t>
+            </w:r>
+          </w:p>
+        </w:tc>
+      </w:tr>
       <w:tr>
         <w:tc>
           <w:tcPr>

</xml_diff>